<commit_message>
Major Updates - Auth System AND Backend for DB.
</commit_message>
<xml_diff>
--- a/docs/backend-plan/AstroData - Feature Architecture Plan.docx
+++ b/docs/backend-plan/AstroData - Feature Architecture Plan.docx
@@ -33299,6 +33299,51 @@
         <w:rPr>
           <w:rtl w:val="0"/>
         </w:rPr>
+      </w:r>
+    </w:p>
+    <w:p>
+      <w:r>
+        <w:t xml:space="preserve">Additional Features Coverage Update (2026-03-09)</w:t>
+      </w:r>
+    </w:p>
+    <w:p>
+      <w:r>
+        <w:t xml:space="preserve">Astrocartography: Missing in current feature rows. Proposed Group B - Personalized.</w:t>
+      </w:r>
+    </w:p>
+    <w:p>
+      <w:r>
+        <w:t xml:space="preserve">Palm Reading: Exists. Group B - Personalized.</w:t>
+      </w:r>
+    </w:p>
+    <w:p>
+      <w:r>
+        <w:t xml:space="preserve">Compatibility: Exists. Group A - Common (pair-specific).</w:t>
+      </w:r>
+    </w:p>
+    <w:p>
+      <w:r>
+        <w:t xml:space="preserve">Moon: Exists. Group A - Common (phase) with sign-level ritual logic.</w:t>
+      </w:r>
+    </w:p>
+    <w:p>
+      <w:r>
+        <w:t xml:space="preserve">Past Lives: Missing in current feature rows.</w:t>
+      </w:r>
+    </w:p>
+    <w:p>
+      <w:r>
+        <w:t xml:space="preserve">Numerology: Mentioned in logic/provider notes; add as standalone feature row if required.</w:t>
+      </w:r>
+    </w:p>
+    <w:p>
+      <w:r>
+        <w:t xml:space="preserve">Soulmate Sketch: Exists. Group B - Personalized.</w:t>
+      </w:r>
+    </w:p>
+    <w:p>
+      <w:r>
+        <w:t xml:space="preserve">Alternative Horoscope Systems: Western and Vedic are present; Chinese is mentioned; Indian Lunar, Indian Solar, Mayan, and Druid are not explicit in current feature rows.</w:t>
       </w:r>
     </w:p>
     <w:sectPr>

</xml_diff>